<commit_message>
docs: o resumo passa a dizer onde estao os arquivos
Ele e o unico arquivo que vai ao portal da disciplina — o pacote tem 208 MB e o
upload e recusado. Um resumo que nao diz onde estao os arquivos nao entrega
nada: entra uma secao com o endereco da pasta e o dos Releases, logo abaixo do
cabecalho, antes de qualquer outra coisa.

Co-Authored-By: Claude Opus 5 (1M context) <noreply@anthropic.com>
Claude-Session: https://claude.ai/code/session_01Fzqw75U9UWNn1yiecRsirX
</commit_message>
<xml_diff>
--- a/entrega-trabalho-1/RESUMO-DA-SUBMISSAO.docx
+++ b/entrega-trabalho-1/RESUMO-DA-SUBMISSAO.docx
@@ -35,6 +35,63 @@
           <w:sz w:val="22"/>
         </w:rPr>
         <w:t>Docentes: Robisom Damasceno Calado e Ilma Rodrigues de Souza Fausto · Estágio em docência: Maicon Gonzaga da Silva</w:t>
+      </w:r>
+    </w:p>
+    <w:p>
+      <w:pPr>
+        <w:pStyle w:val="Heading1"/>
+      </w:pPr>
+      <w:r>
+        <w:rPr>
+          <w:color w:val="1A1A1A"/>
+        </w:rPr>
+        <w:t>Onde estão os arquivos</w:t>
+      </w:r>
+    </w:p>
+    <w:p>
+      <w:pPr>
+        <w:jc w:val="left"/>
+      </w:pPr>
+      <w:r>
+        <w:rPr>
+          <w:b w:val="0"/>
+          <w:sz w:val="22"/>
+        </w:rPr>
+        <w:t>O material completo tem 208 MB, porque cada arquivo carrega a mídia dentro — e por isso ele está publicado, e não anexado. Este resumo é o índice; os arquivos estão nos dois endereços abaixo.</w:t>
+      </w:r>
+    </w:p>
+    <w:p>
+      <w:pPr>
+        <w:pStyle w:val="ListBullet"/>
+      </w:pPr>
+      <w:r>
+        <w:rPr>
+          <w:sz w:val="22"/>
+        </w:rPr>
+        <w:t>Relatórios de auditoria, transcrição linear, leitura simulada, figuras e o PDF marcado: https://github.com/RaulAraujoSilva/acessibilidade-total/tree/main/entrega-trabalho-1</w:t>
+      </w:r>
+    </w:p>
+    <w:p>
+      <w:pPr>
+        <w:pStyle w:val="ListBullet"/>
+      </w:pPr>
+      <w:r>
+        <w:rPr>
+          <w:sz w:val="22"/>
+        </w:rPr>
+        <w:t>As sete apresentações, com a audiodescrição e a janela de Libras dentro do arquivo, e as faixas soltas: https://github.com/RaulAraujoSilva/acessibilidade-total/releases/tag/trabalho-1</w:t>
+      </w:r>
+    </w:p>
+    <w:p>
+      <w:pPr>
+        <w:jc w:val="left"/>
+      </w:pPr>
+      <w:r>
+        <w:rPr>
+          <w:b w:val="0"/>
+          <w:sz w:val="22"/>
+        </w:rPr>
+        <w:t>Comece pelo LEIA-ME.md da primeira pasta: ele diz qual das sete versões abrir, o que cada uma carrega e o que este material não entrega.</w:t>
       </w:r>
     </w:p>
     <w:p>

</xml_diff>